<commit_message>
docs: write stage 3
</commit_message>
<xml_diff>
--- a/docs/docx/01.docx
+++ b/docs/docx/01.docx
@@ -6,7 +6,7 @@
       <w:pPr>
         <w:pStyle w:val="FirstParagraph"/>
       </w:pPr>
-      <w:hyperlink r:id="rId21">
+      <w:hyperlink r:id="rId33">
         <w:r>
           <w:rPr>
             <w:rStyle w:val="900"/>
@@ -15,7 +15,7 @@
         </w:r>
       </w:hyperlink>
     </w:p>
-    <w:bookmarkStart w:id="22" w:name="предметная-область"/>
+    <w:bookmarkStart w:id="34" w:name="предметная-область"/>
     <w:p>
       <w:pPr>
         <w:pStyle w:val="916"/>
@@ -32,8 +32,8 @@
         <w:t xml:space="preserve">Предметная область - IT. Данный проект создаётся как инструмент для организации командной разработки, который интегрируется с Github Projects. Он решает проблему низкой эффективности использования Github Projects и GH cli для работы с проектами. Что достигается посредством предоставления API для работы с Github Projects с TUI интерфейсом и поддержкой клавиатурных сокращений.</w:t>
       </w:r>
     </w:p>
-    <w:bookmarkEnd w:id="22"/>
-    <w:bookmarkStart w:id="23" w:name="таблица-ролей"/>
+    <w:bookmarkEnd w:id="34"/>
+    <w:bookmarkStart w:id="35" w:name="таблица-ролей"/>
     <w:p>
       <w:pPr>
         <w:pStyle w:val="916"/>
@@ -153,8 +153,8 @@
         </w:tc>
       </w:tr>
     </w:tbl>
-    <w:bookmarkEnd w:id="23"/>
-    <w:bookmarkStart w:id="27" w:name="схемы"/>
+    <w:bookmarkEnd w:id="35"/>
+    <w:bookmarkStart w:id="39" w:name="схемы"/>
     <w:p>
       <w:pPr>
         <w:pStyle w:val="916"/>
@@ -172,18 +172,18 @@
           <wp:inline>
             <wp:extent cx="5943600" cy="2274336"/>
             <wp:effectExtent b="0" l="0" r="0" t="0"/>
-            <wp:docPr descr="" title="" id="25" name="Picture"/>
+            <wp:docPr descr="" title="" id="37" name="Picture"/>
             <a:graphic>
               <a:graphicData uri="http://schemas.openxmlformats.org/drawingml/2006/picture">
                 <pic:pic>
                   <pic:nvPicPr>
-                    <pic:cNvPr descr="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" id="26" name="Picture"/>
+                    <pic:cNvPr descr="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" id="38" name="Picture"/>
                     <pic:cNvPicPr>
                       <a:picLocks noChangeArrowheads="1" noChangeAspect="1"/>
                     </pic:cNvPicPr>
                   </pic:nvPicPr>
                   <pic:blipFill>
-                    <a:blip r:embed="rId24"/>
+                    <a:blip r:embed="rId36"/>
                     <a:stretch>
                       <a:fillRect/>
                     </a:stretch>
@@ -210,8 +210,8 @@
         </w:drawing>
       </w:r>
     </w:p>
-    <w:bookmarkEnd w:id="27"/>
-    <w:bookmarkStart w:id="28" w:name="модель-проектирования"/>
+    <w:bookmarkEnd w:id="39"/>
+    <w:bookmarkStart w:id="40" w:name="модель-проектирования"/>
     <w:p>
       <w:pPr>
         <w:pStyle w:val="916"/>
@@ -384,7 +384,7 @@
         <w:t xml:space="preserve">Была выбрана смешанная модель по той причине, что она более гибкая и с ней можно просто писать сложный, но лёгкий для восприятия код.</w:t>
       </w:r>
     </w:p>
-    <w:bookmarkEnd w:id="28"/>
+    <w:bookmarkEnd w:id="40"/>
     <w:sectPr>
       <w:headerReference r:id="rId9" w:type="first"/>
       <w:footerReference r:id="rId10" w:type="default"/>

</xml_diff>